<commit_message>
updated main header text
</commit_message>
<xml_diff>
--- a/build/documents/cv_nipuna_c_gomes.docx
+++ b/build/documents/cv_nipuna_c_gomes.docx
@@ -5,116 +5,226 @@
     <w:p>
       <w:pPr>
         <w:pStyle w:val="Title"/>
-        <w:jc w:val="center"/>
-      </w:pPr>
-      <w:r>
-        <w:t>NIPUNA C. GOMES</w:t>
+        <w:rPr>
+          <w:rStyle w:val="Heading1Char"/>
+          <w:sz w:val="52"/>
+        </w:rPr>
+      </w:pPr>
+      <w:r>
+        <w:rPr>
+          <w:rStyle w:val="Heading1Char"/>
+          <w:sz w:val="52"/>
+        </w:rPr>
+        <w:t>NIPUNA GOMES</w:t>
       </w:r>
     </w:p>
     <w:p>
       <w:pPr>
-        <w:jc w:val="center"/>
-      </w:pPr>
-      <w:r>
-        <w:t xml:space="preserve">Colombo, Sri Lanka | </w:t>
+        <w:pStyle w:val="Title"/>
+      </w:pPr>
+      <w:r>
+        <w:rPr>
+          <w:rStyle w:val="Heading1Char"/>
+        </w:rPr>
+        <w:t>TECH LEAD</w:t>
+      </w:r>
+      <w:r>
+        <w:rPr>
+          <w:rStyle w:val="Heading1Char"/>
+        </w:rPr>
+        <w:t xml:space="preserve"> </w:t>
+      </w:r>
+    </w:p>
+    <w:p>
+      <w:pPr>
+        <w:jc w:val="both"/>
+      </w:pPr>
+      <w:r>
+        <w:t xml:space="preserve">Colombo, SL (UTC+5.30) | Open to Remote | </w:t>
+      </w:r>
+      <w:r>
+        <w:t>dkcnipunagomes@gmail.com</w:t>
+      </w:r>
+      <w:r>
+        <w:t xml:space="preserve"> </w:t>
+      </w:r>
+      <w:r>
+        <w:t xml:space="preserve">| +94 </w:t>
+      </w:r>
+      <w:r>
+        <w:t xml:space="preserve">77 </w:t>
+      </w:r>
+      <w:r>
+        <w:t>24</w:t>
+      </w:r>
+      <w:r>
+        <w:t>22 777</w:t>
+      </w:r>
+      <w:r>
+        <w:t xml:space="preserve"> </w:t>
+      </w:r>
+      <w:r>
+        <w:br/>
+      </w:r>
+      <w:r>
+        <w:br/>
       </w:r>
       <w:hyperlink r:id="rId6" w:history="1">
         <w:r>
           <w:rPr>
             <w:rStyle w:val="Hyperlink"/>
           </w:rPr>
-          <w:t>linkedin.com/in/nipuna-c-gomes-39500743</w:t>
+          <w:t>linkedin.com/in/</w:t>
         </w:r>
-      </w:hyperlink>
-      <w:r>
-        <w:br/>
-      </w:r>
-      <w:hyperlink r:id="rId7" w:history="1">
+        <w:proofErr w:type="spellStart"/>
         <w:r>
           <w:rPr>
             <w:rStyle w:val="Hyperlink"/>
           </w:rPr>
-          <w:t>nipunachaminda@gmail.com</w:t>
+          <w:t>nipuna-gomes</w:t>
         </w:r>
+        <w:proofErr w:type="spellEnd"/>
       </w:hyperlink>
-      <w:r>
-        <w:t xml:space="preserve"> </w:t>
-      </w:r>
-      <w:r>
-        <w:t xml:space="preserve">| +94 </w:t>
-      </w:r>
-      <w:r>
-        <w:t>77 24 22 777</w:t>
-      </w:r>
     </w:p>
     <w:p>
       <w:pPr>
         <w:pStyle w:val="Heading1"/>
-      </w:pPr>
-      <w:r>
-        <w:t>Professional Summary</w:t>
+        <w:rPr>
+          <w:rFonts w:asciiTheme="minorHAnsi" w:eastAsiaTheme="minorEastAsia" w:hAnsiTheme="minorHAnsi" w:cstheme="minorBidi"/>
+          <w:b w:val="0"/>
+          <w:bCs w:val="0"/>
+          <w:color w:val="auto"/>
+          <w:sz w:val="22"/>
+          <w:szCs w:val="22"/>
+        </w:rPr>
+      </w:pPr>
+      <w:r>
+        <w:rPr>
+          <w:caps/>
+        </w:rPr>
+        <w:t>Summary</w:t>
+      </w:r>
+      <w:r>
+        <w:br/>
+      </w:r>
+      <w:r>
+        <w:br/>
+      </w:r>
+      <w:r>
+        <w:rPr>
+          <w:rFonts w:asciiTheme="minorHAnsi" w:eastAsiaTheme="minorEastAsia" w:hAnsiTheme="minorHAnsi" w:cstheme="minorBidi"/>
+          <w:b w:val="0"/>
+          <w:bCs w:val="0"/>
+          <w:color w:val="auto"/>
+          <w:sz w:val="22"/>
+          <w:szCs w:val="22"/>
+        </w:rPr>
+        <w:t xml:space="preserve">Technical Lead with over 10 years of experience delivering scalable, fault-tolerant enterprise solutions in Fintech and </w:t>
+      </w:r>
+      <w:proofErr w:type="spellStart"/>
+      <w:r>
+        <w:rPr>
+          <w:rFonts w:asciiTheme="minorHAnsi" w:eastAsiaTheme="minorEastAsia" w:hAnsiTheme="minorHAnsi" w:cstheme="minorBidi"/>
+          <w:b w:val="0"/>
+          <w:bCs w:val="0"/>
+          <w:color w:val="auto"/>
+          <w:sz w:val="22"/>
+          <w:szCs w:val="22"/>
+        </w:rPr>
+        <w:t>eCommerce</w:t>
+      </w:r>
+      <w:proofErr w:type="spellEnd"/>
+      <w:r>
+        <w:rPr>
+          <w:rFonts w:asciiTheme="minorHAnsi" w:eastAsiaTheme="minorEastAsia" w:hAnsiTheme="minorHAnsi" w:cstheme="minorBidi"/>
+          <w:b w:val="0"/>
+          <w:bCs w:val="0"/>
+          <w:color w:val="auto"/>
+          <w:sz w:val="22"/>
+          <w:szCs w:val="22"/>
+        </w:rPr>
+        <w:t xml:space="preserve">. AWS Certified Solutions Architect (Associate) with a proven track record in establishing rigorous technical standards and optimizing system performance.  </w:t>
+      </w:r>
+      <w:r>
+        <w:rPr>
+          <w:rFonts w:asciiTheme="minorHAnsi" w:eastAsiaTheme="minorEastAsia" w:hAnsiTheme="minorHAnsi" w:cstheme="minorBidi"/>
+          <w:b w:val="0"/>
+          <w:bCs w:val="0"/>
+          <w:color w:val="auto"/>
+          <w:sz w:val="22"/>
+          <w:szCs w:val="22"/>
+        </w:rPr>
+        <w:br/>
       </w:r>
     </w:p>
     <w:p>
-      <w:r>
-        <w:t>Highly skilled Senior Software Engineer and Tech Lead with over 10 years of experience in designing, developing, and</w:t>
-      </w:r>
-      <w:r>
-        <w:t xml:space="preserve"> maintaining complex enterprise applications. Expert in Full-stack development with a focus on </w:t>
-      </w:r>
-      <w:r>
-        <w:t>React/C#/MySQL, Micro services</w:t>
-      </w:r>
-      <w:r>
-        <w:t>, and Cloud technologies. Proven track record of leading development teams, optimizing system performance, and delivering hi</w:t>
-      </w:r>
-      <w:r>
-        <w:t>gh-quality software solutions in the Fintech and eCommerce sectors.</w:t>
+      <w:pPr>
+        <w:pStyle w:val="ListParagraph"/>
+        <w:numPr>
+          <w:ilvl w:val="0"/>
+          <w:numId w:val="12"/>
+        </w:numPr>
+      </w:pPr>
+      <w:r>
+        <w:t xml:space="preserve">Architectural Evolution: Expert in migrating legacy monoliths to high-performance </w:t>
+      </w:r>
+      <w:proofErr w:type="spellStart"/>
+      <w:r>
+        <w:t>Microservices</w:t>
+      </w:r>
+      <w:proofErr w:type="spellEnd"/>
+      <w:r>
+        <w:t xml:space="preserve"> using Clean Architecture, CQRS, and Event-Driven patterns</w:t>
+      </w:r>
+      <w:r>
+        <w:br/>
       </w:r>
     </w:p>
     <w:p>
       <w:pPr>
-        <w:pStyle w:val="Heading1"/>
-      </w:pPr>
-      <w:r>
-        <w:t>Core Competencies</w:t>
+        <w:pStyle w:val="ListParagraph"/>
+        <w:numPr>
+          <w:ilvl w:val="0"/>
+          <w:numId w:val="12"/>
+        </w:numPr>
+      </w:pPr>
+      <w:r>
+        <w:t>Operational Excellence: Demonstrated success in maintaining 99.9% system uptime and improving code maintainability by 60% through automated testing and CI/CD optimization.</w:t>
+      </w:r>
+      <w:r>
+        <w:br/>
       </w:r>
     </w:p>
     <w:p>
       <w:pPr>
-        <w:pStyle w:val="ListBullet"/>
-      </w:pPr>
-      <w:r>
-        <w:rPr>
-          <w:b/>
-        </w:rPr>
-        <w:t xml:space="preserve">Languages: </w:t>
-      </w:r>
-      <w:r>
-        <w:t>C#</w:t>
-      </w:r>
-      <w:r>
-        <w:t xml:space="preserve">, </w:t>
-      </w:r>
-      <w:r>
-        <w:t>JavaScript, SQL, HTML5, CSS3</w:t>
+        <w:pStyle w:val="ListParagraph"/>
+        <w:numPr>
+          <w:ilvl w:val="0"/>
+          <w:numId w:val="12"/>
+        </w:numPr>
+      </w:pPr>
+      <w:r>
+        <w:t>Engineering Leadership: Specialized in scaling culture via technical mentorship and structured peer-review systems, achieving an 80% success rate in developer performance coaching.</w:t>
       </w:r>
     </w:p>
     <w:p>
       <w:pPr>
-        <w:pStyle w:val="ListBullet"/>
-      </w:pPr>
-      <w:r>
-        <w:rPr>
-          <w:b/>
-        </w:rPr>
-        <w:t xml:space="preserve">Frameworks: </w:t>
-      </w:r>
-      <w:r>
-        <w:t>Next.js</w:t>
-      </w:r>
-      <w:r>
-        <w:t>, React, Node.js</w:t>
+        <w:pStyle w:val="Heading1"/>
+        <w:rPr>
+          <w:caps/>
+        </w:rPr>
+      </w:pPr>
+      <w:r>
+        <w:rPr>
+          <w:caps/>
+        </w:rPr>
+        <w:t>Technical Skills</w:t>
+      </w:r>
+      <w:r>
+        <w:rPr>
+          <w:caps/>
+        </w:rPr>
+        <w:br/>
       </w:r>
     </w:p>
     <w:p>
@@ -125,16 +235,24 @@
         <w:rPr>
           <w:b/>
         </w:rPr>
-        <w:t xml:space="preserve">Cloud &amp; DevOps: </w:t>
-      </w:r>
-      <w:r>
-        <w:t>AWS (EC2, S3, La</w:t>
-      </w:r>
-      <w:r>
-        <w:t xml:space="preserve">mbda), Docker, </w:t>
-      </w:r>
-      <w:r>
-        <w:t>Jenkins, Git, Terraform</w:t>
+        <w:t xml:space="preserve">Architecture: </w:t>
+      </w:r>
+      <w:proofErr w:type="spellStart"/>
+      <w:r>
+        <w:t>Microservices</w:t>
+      </w:r>
+      <w:proofErr w:type="spellEnd"/>
+      <w:r>
+        <w:t>, RESTful APIs, Event-Driven Architecture</w:t>
+      </w:r>
+      <w:r>
+        <w:t>,</w:t>
+      </w:r>
+      <w:r>
+        <w:t xml:space="preserve"> </w:t>
+      </w:r>
+      <w:r>
+        <w:t>CQRS and Clean Architecture</w:t>
       </w:r>
     </w:p>
     <w:p>
@@ -145,13 +263,13 @@
         <w:rPr>
           <w:b/>
         </w:rPr>
-        <w:t xml:space="preserve">Databases: </w:t>
-      </w:r>
-      <w:r>
-        <w:t xml:space="preserve">MySQL, </w:t>
-      </w:r>
-      <w:r>
-        <w:t>MS SQL</w:t>
+        <w:t xml:space="preserve">Languages: </w:t>
+      </w:r>
+      <w:r>
+        <w:t>C#</w:t>
+      </w:r>
+      <w:r>
+        <w:t>, JavaScript, SQL, HTML5, CSS3</w:t>
       </w:r>
     </w:p>
     <w:p>
@@ -162,76 +280,233 @@
         <w:rPr>
           <w:b/>
         </w:rPr>
-        <w:t xml:space="preserve">Architecture: </w:t>
-      </w:r>
-      <w:r>
-        <w:t>Microservices, RESTful APIs, Event-Driven Architecture, Design Patterns</w:t>
+        <w:t xml:space="preserve">Frameworks: </w:t>
+      </w:r>
+      <w:r>
+        <w:t>Next.js</w:t>
+      </w:r>
+      <w:r>
+        <w:t xml:space="preserve">, React, </w:t>
+      </w:r>
+      <w:r>
+        <w:t xml:space="preserve">Node.js, </w:t>
+      </w:r>
+      <w:proofErr w:type="gramStart"/>
+      <w:r>
+        <w:t>Vite</w:t>
+      </w:r>
+      <w:r>
+        <w:t xml:space="preserve"> ,</w:t>
+      </w:r>
+      <w:proofErr w:type="gramEnd"/>
+      <w:r>
+        <w:t xml:space="preserve"> TypeScript</w:t>
       </w:r>
     </w:p>
     <w:p>
       <w:pPr>
-        <w:pStyle w:val="Heading1"/>
-      </w:pPr>
-      <w:r>
-        <w:t>Professional Experience</w:t>
+        <w:pStyle w:val="ListBullet"/>
+      </w:pPr>
+      <w:r>
+        <w:rPr>
+          <w:b/>
+        </w:rPr>
+        <w:t xml:space="preserve">Cloud &amp; DevOps: </w:t>
+      </w:r>
+      <w:r>
+        <w:t>AWS (EC2, S3, Lambda</w:t>
+      </w:r>
+      <w:r>
+        <w:t>, VPC, IAM</w:t>
+      </w:r>
+      <w:r>
+        <w:t xml:space="preserve">), Docker, Jenkins, </w:t>
+      </w:r>
+      <w:proofErr w:type="spellStart"/>
+      <w:r>
+        <w:t>Git</w:t>
+      </w:r>
+      <w:proofErr w:type="spellEnd"/>
+      <w:r>
+        <w:t>, Terraform</w:t>
       </w:r>
     </w:p>
     <w:p>
+      <w:pPr>
+        <w:pStyle w:val="ListBullet"/>
+      </w:pPr>
       <w:r>
         <w:rPr>
           <w:b/>
         </w:rPr>
-        <w:t>Tech Lead / Senior Software Engineer</w:t>
-      </w:r>
-      <w:r>
-        <w:rPr>
-          <w:i/>
-        </w:rPr>
-        <w:tab/>
-      </w:r>
-      <w:r>
-        <w:rPr>
-          <w:i/>
-        </w:rPr>
-        <w:tab/>
-      </w:r>
-      <w:r>
-        <w:rPr>
-          <w:i/>
-        </w:rPr>
-        <w:tab/>
-      </w:r>
-      <w:r>
-        <w:rPr>
-          <w:i/>
-        </w:rPr>
-        <w:tab/>
-      </w:r>
-      <w:r>
-        <w:rPr>
-          <w:i/>
-        </w:rPr>
-        <w:tab/>
-        <w:t>2</w:t>
-      </w:r>
-      <w:r>
-        <w:rPr>
-          <w:i/>
-        </w:rPr>
-        <w:t>019 – Present</w:t>
+        <w:t xml:space="preserve">Databases: </w:t>
+      </w:r>
+      <w:r>
+        <w:t xml:space="preserve">MySQL, </w:t>
+      </w:r>
+      <w:r>
+        <w:t>MS SQL</w:t>
       </w:r>
     </w:p>
     <w:p>
-      <w:r>
-        <w:t>Leading Tech Firm (Colombo, Sri Lanka)</w:t>
+      <w:pPr>
+        <w:pStyle w:val="ListBullet"/>
+        <w:tabs>
+          <w:tab w:val="clear" w:pos="360"/>
+        </w:tabs>
+        <w:rPr>
+          <w:caps/>
+        </w:rPr>
+      </w:pPr>
+      <w:r>
+        <w:t>AI &amp; Modern Tools:</w:t>
+      </w:r>
+      <w:r>
+        <w:t xml:space="preserve"> Prompt Engineering, Agentic Coordination</w:t>
+      </w:r>
+      <w:r>
+        <w:br/>
       </w:r>
     </w:p>
     <w:p>
-      <w:pPr>
-        <w:pStyle w:val="ListBullet"/>
-      </w:pPr>
-      <w:r>
-        <w:t>Lead a cross-functional team of 8 developers to build and scale a high-traffic financial transaction platform handling 1M+ daily requests.</w:t>
+      <w:r>
+        <w:rPr>
+          <w:rFonts w:asciiTheme="majorHAnsi" w:eastAsiaTheme="majorEastAsia" w:hAnsiTheme="majorHAnsi" w:cstheme="majorBidi"/>
+          <w:b/>
+          <w:bCs/>
+          <w:caps/>
+          <w:color w:val="365F91" w:themeColor="accent1" w:themeShade="BF"/>
+          <w:sz w:val="28"/>
+          <w:szCs w:val="28"/>
+        </w:rPr>
+        <w:t>Professional Experience</w:t>
+      </w:r>
+      <w:r>
+        <w:rPr>
+          <w:b/>
+        </w:rPr>
+        <w:t xml:space="preserve"> </w:t>
+      </w:r>
+      <w:r>
+        <w:rPr>
+          <w:b/>
+        </w:rPr>
+        <w:br/>
+      </w:r>
+      <w:r>
+        <w:rPr>
+          <w:b/>
+        </w:rPr>
+        <w:br/>
+      </w:r>
+      <w:r>
+        <w:rPr>
+          <w:b/>
+        </w:rPr>
+        <w:t xml:space="preserve">Tech Lead </w:t>
+      </w:r>
+      <w:r>
+        <w:rPr>
+          <w:b/>
+        </w:rPr>
+        <w:t xml:space="preserve">- </w:t>
+      </w:r>
+      <w:proofErr w:type="spellStart"/>
+      <w:r>
+        <w:rPr>
+          <w:b/>
+        </w:rPr>
+        <w:t>Autoavans</w:t>
+      </w:r>
+      <w:proofErr w:type="spellEnd"/>
+      <w:r>
+        <w:rPr>
+          <w:b/>
+        </w:rPr>
+        <w:t xml:space="preserve"> Technology </w:t>
+      </w:r>
+      <w:r>
+        <w:rPr>
+          <w:b/>
+          <w:sz w:val="20"/>
+        </w:rPr>
+        <w:t>(Sweden</w:t>
+      </w:r>
+      <w:r>
+        <w:rPr>
+          <w:b/>
+          <w:sz w:val="20"/>
+        </w:rPr>
+        <w:t xml:space="preserve"> based Business Operations</w:t>
+      </w:r>
+      <w:r>
+        <w:rPr>
+          <w:b/>
+          <w:sz w:val="20"/>
+        </w:rPr>
+        <w:t>)</w:t>
+      </w:r>
+      <w:r>
+        <w:rPr>
+          <w:b/>
+        </w:rPr>
+        <w:tab/>
+      </w:r>
+      <w:r>
+        <w:rPr>
+          <w:b/>
+          <w:sz w:val="20"/>
+        </w:rPr>
+        <w:tab/>
+      </w:r>
+      <w:r>
+        <w:rPr>
+          <w:b/>
+          <w:sz w:val="20"/>
+        </w:rPr>
+        <w:tab/>
+      </w:r>
+      <w:r>
+        <w:rPr>
+          <w:b/>
+          <w:sz w:val="20"/>
+        </w:rPr>
+        <w:tab/>
+      </w:r>
+      <w:r>
+        <w:rPr>
+          <w:b/>
+          <w:sz w:val="20"/>
+        </w:rPr>
+        <w:tab/>
+      </w:r>
+      <w:r>
+        <w:rPr>
+          <w:b/>
+          <w:sz w:val="20"/>
+        </w:rPr>
+        <w:t xml:space="preserve"> </w:t>
+      </w:r>
+      <w:r>
+        <w:rPr>
+          <w:i/>
+          <w:sz w:val="20"/>
+        </w:rPr>
+        <w:t>July</w:t>
+      </w:r>
+      <w:r>
+        <w:rPr>
+          <w:i/>
+          <w:sz w:val="20"/>
+        </w:rPr>
+        <w:t xml:space="preserve"> 2025</w:t>
+      </w:r>
+      <w:r>
+        <w:rPr>
+          <w:i/>
+          <w:sz w:val="20"/>
+        </w:rPr>
+        <w:t xml:space="preserve"> - present</w:t>
       </w:r>
     </w:p>
     <w:p>
@@ -239,30 +514,47 @@
         <w:pStyle w:val="ListBullet"/>
       </w:pPr>
       <w:r>
-        <w:t xml:space="preserve">Architected a migration from monolithic architecture to </w:t>
-      </w:r>
-      <w:r>
-        <w:t>Micro services</w:t>
-      </w:r>
-      <w:r>
-        <w:t xml:space="preserve"> using </w:t>
-      </w:r>
-      <w:r>
-        <w:t>AWS Services</w:t>
-      </w:r>
-      <w:r>
-        <w:t>, reducing system latency by 40%.</w:t>
+        <w:t xml:space="preserve">Lead a cross-functional team of </w:t>
+      </w:r>
+      <w:r>
+        <w:t>4</w:t>
+      </w:r>
+      <w:r>
+        <w:t xml:space="preserve"> </w:t>
+      </w:r>
+      <w:r>
+        <w:t>engineers to</w:t>
+      </w:r>
+      <w:r>
+        <w:t xml:space="preserve"> build and scale a high-traffic financial transaction</w:t>
+      </w:r>
+      <w:r>
+        <w:t>.</w:t>
+      </w:r>
+      <w:r>
+        <w:t xml:space="preserve"> platform handling 1M+ daily requests.</w:t>
       </w:r>
     </w:p>
     <w:p>
       <w:pPr>
         <w:pStyle w:val="ListBullet"/>
-      </w:pPr>
-      <w:r>
-        <w:t xml:space="preserve">Implemented CI/CD pipelines using Jenkins </w:t>
-      </w:r>
-      <w:r>
-        <w:t>increasing deployment frequency by 60% and reducing manual errors.</w:t>
+        <w:tabs>
+          <w:tab w:val="clear" w:pos="360"/>
+        </w:tabs>
+      </w:pPr>
+      <w:r>
+        <w:t xml:space="preserve">Responsible for Release management using CI/CD pipelines and </w:t>
+      </w:r>
+      <w:proofErr w:type="spellStart"/>
+      <w:r>
+        <w:t>GitLab</w:t>
+      </w:r>
+      <w:proofErr w:type="spellEnd"/>
+      <w:r>
+        <w:t xml:space="preserve"> </w:t>
+      </w:r>
+      <w:r>
+        <w:t>and AWS Services.</w:t>
       </w:r>
     </w:p>
     <w:p>
@@ -270,114 +562,188 @@
         <w:pStyle w:val="ListBullet"/>
       </w:pPr>
       <w:r>
-        <w:t>Mentored junior engineers through code reviews and technical worksho</w:t>
-      </w:r>
-      <w:r>
-        <w:t>ps, fostering a culture of continuous learning.</w:t>
-      </w:r>
-      <w:r>
-        <w:br/>
-      </w:r>
-      <w:r>
-        <w:br/>
-      </w:r>
-      <w:r>
-        <w:br/>
-      </w:r>
-      <w:r>
-        <w:br/>
-      </w:r>
-      <w:r>
-        <w:br/>
-      </w:r>
-      <w:r>
-        <w:br/>
-      </w:r>
-      <w:r>
-        <w:br/>
-      </w:r>
-      <w:r>
-        <w:br/>
-      </w:r>
-      <w:r>
-        <w:br/>
-      </w:r>
-      <w:r>
-        <w:br/>
-      </w:r>
-      <w:r>
-        <w:br/>
+        <w:t xml:space="preserve">Contributed in converting </w:t>
+      </w:r>
+      <w:r>
+        <w:t xml:space="preserve">React </w:t>
+      </w:r>
+      <w:r>
+        <w:t xml:space="preserve">app </w:t>
+      </w:r>
+      <w:r>
+        <w:t xml:space="preserve">to Vite, </w:t>
+      </w:r>
+      <w:r>
+        <w:t>improving hot reload speed by 10x</w:t>
+      </w:r>
+      <w:r>
+        <w:t>.</w:t>
       </w:r>
     </w:p>
     <w:p>
-      <w:r>
-        <w:rPr>
-          <w:b/>
-        </w:rPr>
-        <w:lastRenderedPageBreak/>
-        <w:t>Software Engineer</w:t>
-      </w:r>
-      <w:r>
-        <w:rPr>
-          <w:i/>
-        </w:rPr>
-        <w:tab/>
-      </w:r>
-      <w:r>
-        <w:rPr>
-          <w:i/>
-        </w:rPr>
-        <w:tab/>
-      </w:r>
-      <w:r>
-        <w:rPr>
-          <w:i/>
-        </w:rPr>
-        <w:tab/>
-      </w:r>
-      <w:r>
-        <w:rPr>
-          <w:i/>
-        </w:rPr>
-        <w:tab/>
-      </w:r>
-      <w:r>
-        <w:rPr>
-          <w:i/>
-        </w:rPr>
-        <w:tab/>
-      </w:r>
-      <w:r>
-        <w:rPr>
-          <w:i/>
-        </w:rPr>
-        <w:tab/>
-      </w:r>
-      <w:r>
-        <w:rPr>
-          <w:i/>
-        </w:rPr>
-        <w:tab/>
-        <w:t>2015 – 2019</w:t>
+      <w:pPr>
+        <w:pStyle w:val="ListBullet"/>
+      </w:pPr>
+      <w:r>
+        <w:t>B</w:t>
+      </w:r>
+      <w:r>
+        <w:t>uilt fault-tolerant APIs with Polly (retry/circuit breaker), achieving 99.9% uptime.</w:t>
       </w:r>
     </w:p>
     <w:p>
-      <w:r>
-        <w:t>Enterprise Solutions Provider</w:t>
+      <w:pPr>
+        <w:pStyle w:val="ListBullet"/>
+      </w:pPr>
+      <w:r>
+        <w:t>Architected a migration from monolithic architecture to Micro services using AWS Services, reducing system latency by 40%.</w:t>
       </w:r>
     </w:p>
     <w:p>
       <w:pPr>
         <w:pStyle w:val="ListBullet"/>
-      </w:pPr>
-      <w:r>
-        <w:t xml:space="preserve">Developed core modules for an international eCommerce platform using </w:t>
-      </w:r>
-      <w:r>
-        <w:t>React and C#, Node js</w:t>
-      </w:r>
-      <w:r>
-        <w:t>.</w:t>
+        <w:numPr>
+          <w:ilvl w:val="0"/>
+          <w:numId w:val="0"/>
+        </w:numPr>
+        <w:tabs>
+          <w:tab w:val="left" w:pos="450"/>
+        </w:tabs>
+        <w:rPr>
+          <w:b/>
+        </w:rPr>
+      </w:pPr>
+      <w:r>
+        <w:lastRenderedPageBreak/>
+        <w:br/>
+      </w:r>
+      <w:r>
+        <w:rPr>
+          <w:b/>
+        </w:rPr>
+        <w:t xml:space="preserve">Associate Tech Lead – The Gifted Company </w:t>
+      </w:r>
+      <w:r>
+        <w:rPr>
+          <w:b/>
+          <w:sz w:val="20"/>
+        </w:rPr>
+        <w:t>(Sweden</w:t>
+      </w:r>
+      <w:r>
+        <w:rPr>
+          <w:b/>
+          <w:sz w:val="20"/>
+        </w:rPr>
+        <w:t xml:space="preserve"> based Business Operations</w:t>
+      </w:r>
+      <w:r>
+        <w:rPr>
+          <w:b/>
+          <w:sz w:val="20"/>
+        </w:rPr>
+        <w:t>)</w:t>
+      </w:r>
+      <w:r>
+        <w:rPr>
+          <w:b/>
+        </w:rPr>
+        <w:tab/>
+      </w:r>
+      <w:r>
+        <w:rPr>
+          <w:b/>
+        </w:rPr>
+        <w:tab/>
+      </w:r>
+      <w:r>
+        <w:rPr>
+          <w:b/>
+        </w:rPr>
+        <w:tab/>
+      </w:r>
+      <w:r>
+        <w:rPr>
+          <w:b/>
+        </w:rPr>
+        <w:br/>
+      </w:r>
+      <w:r>
+        <w:rPr>
+          <w:i/>
+          <w:sz w:val="20"/>
+        </w:rPr>
+        <w:t>Ju</w:t>
+      </w:r>
+      <w:r>
+        <w:rPr>
+          <w:i/>
+          <w:sz w:val="20"/>
+        </w:rPr>
+        <w:t>n</w:t>
+      </w:r>
+      <w:r>
+        <w:rPr>
+          <w:i/>
+          <w:sz w:val="20"/>
+        </w:rPr>
+        <w:t>e</w:t>
+      </w:r>
+      <w:r>
+        <w:rPr>
+          <w:i/>
+          <w:sz w:val="20"/>
+        </w:rPr>
+        <w:t xml:space="preserve"> 20</w:t>
+      </w:r>
+      <w:r>
+        <w:rPr>
+          <w:i/>
+          <w:sz w:val="20"/>
+        </w:rPr>
+        <w:t>2</w:t>
+      </w:r>
+      <w:r>
+        <w:rPr>
+          <w:i/>
+          <w:sz w:val="20"/>
+        </w:rPr>
+        <w:t>4</w:t>
+      </w:r>
+      <w:r>
+        <w:rPr>
+          <w:i/>
+          <w:sz w:val="20"/>
+        </w:rPr>
+        <w:t xml:space="preserve"> - Ju</w:t>
+      </w:r>
+      <w:r>
+        <w:rPr>
+          <w:i/>
+          <w:sz w:val="20"/>
+        </w:rPr>
+        <w:t>ly</w:t>
+      </w:r>
+      <w:r>
+        <w:rPr>
+          <w:i/>
+          <w:sz w:val="20"/>
+        </w:rPr>
+        <w:t xml:space="preserve"> 20</w:t>
+      </w:r>
+      <w:r>
+        <w:rPr>
+          <w:i/>
+          <w:sz w:val="20"/>
+        </w:rPr>
+        <w:t>25</w:t>
+      </w:r>
+      <w:r>
+        <w:rPr>
+          <w:i/>
+          <w:sz w:val="20"/>
+        </w:rPr>
+        <w:br/>
       </w:r>
     </w:p>
     <w:p>
@@ -385,10 +751,25 @@
         <w:pStyle w:val="ListBullet"/>
       </w:pPr>
       <w:r>
-        <w:t>Collaborated with product managers to define</w:t>
-      </w:r>
-      <w:r>
-        <w:t xml:space="preserve"> technical requirements and provide effort estimations for quarterly roadmaps.</w:t>
+        <w:t xml:space="preserve">Implemented </w:t>
+      </w:r>
+      <w:r>
+        <w:t>front end web application</w:t>
+      </w:r>
+      <w:r>
+        <w:t xml:space="preserve"> solution</w:t>
+      </w:r>
+      <w:r>
+        <w:t xml:space="preserve"> for Gifted company Card Redeem Platform using </w:t>
+      </w:r>
+      <w:r>
+        <w:br/>
+      </w:r>
+      <w:r>
+        <w:t>React &amp; Next.js (Typescript/JavaScript)</w:t>
+      </w:r>
+      <w:r>
+        <w:t>.</w:t>
       </w:r>
     </w:p>
     <w:p>
@@ -396,49 +777,1076 @@
         <w:pStyle w:val="ListBullet"/>
       </w:pPr>
       <w:r>
-        <w:t>Optimized database queries and indexing strategies, improving application r</w:t>
+        <w:t xml:space="preserve">Optimized front end application code to improve data loading time by 30% with Next </w:t>
+      </w:r>
+      <w:proofErr w:type="spellStart"/>
+      <w:r>
+        <w:t>Js</w:t>
+      </w:r>
+      <w:proofErr w:type="spellEnd"/>
+      <w:r>
+        <w:t xml:space="preserve"> Server Side Rendering</w:t>
+      </w:r>
+      <w:r>
+        <w:t>.</w:t>
+      </w:r>
+    </w:p>
+    <w:p>
+      <w:pPr>
+        <w:pStyle w:val="ListBullet"/>
+      </w:pPr>
+      <w:r>
+        <w:t xml:space="preserve">Collaborated with product managers to define technical requirements and provide effort estimations for </w:t>
+      </w:r>
+      <w:r>
+        <w:t>weekly</w:t>
+      </w:r>
+      <w:r>
+        <w:t xml:space="preserve"> roadmaps.</w:t>
+      </w:r>
+    </w:p>
+    <w:p>
+      <w:pPr>
+        <w:pStyle w:val="ListBullet"/>
+      </w:pPr>
+      <w:r>
+        <w:t>Responsible for implementing required customized G</w:t>
+      </w:r>
+      <w:r>
+        <w:t xml:space="preserve">oogle tags and integrated with </w:t>
+      </w:r>
+      <w:r>
+        <w:br/>
+      </w:r>
+      <w:r>
+        <w:t>Google Analytics</w:t>
+      </w:r>
+      <w:r>
+        <w:t xml:space="preserve"> </w:t>
+      </w:r>
+      <w:r>
+        <w:t>dash</w:t>
+      </w:r>
+      <w:r>
+        <w:t xml:space="preserve"> boards to identify site traff</w:t>
+      </w:r>
+      <w:r>
+        <w:t>ic and user behavioral patterns.</w:t>
+      </w:r>
+    </w:p>
+    <w:p>
+      <w:pPr>
+        <w:pStyle w:val="ListBullet"/>
+      </w:pPr>
+      <w:r>
+        <w:t>Responsible for balancing</w:t>
+      </w:r>
+      <w:r>
+        <w:t xml:space="preserve"> feature delivery with technical debt management</w:t>
+      </w:r>
+      <w:r>
+        <w:t>.</w:t>
+      </w:r>
+    </w:p>
+    <w:p>
+      <w:pPr>
+        <w:pStyle w:val="ListBullet"/>
+      </w:pPr>
+      <w:r>
+        <w:t>Responsible for communicating</w:t>
+      </w:r>
+      <w:r>
+        <w:t xml:space="preserve"> risks, trade-offs, and decisions clearly</w:t>
+      </w:r>
+      <w:r>
+        <w:t xml:space="preserve"> with product team</w:t>
+      </w:r>
+      <w:r>
+        <w:t>.</w:t>
+      </w:r>
+    </w:p>
+    <w:p>
+      <w:pPr>
+        <w:rPr>
+          <w:sz w:val="20"/>
+        </w:rPr>
+      </w:pPr>
+      <w:r>
+        <w:rPr>
+          <w:b/>
+        </w:rPr>
+        <w:br/>
+      </w:r>
+      <w:r>
+        <w:rPr>
+          <w:b/>
+        </w:rPr>
+        <w:t xml:space="preserve">Associate </w:t>
+      </w:r>
+      <w:r>
+        <w:rPr>
+          <w:b/>
+        </w:rPr>
+        <w:t xml:space="preserve">Tech Lead - </w:t>
+      </w:r>
+      <w:proofErr w:type="spellStart"/>
+      <w:r>
+        <w:rPr>
+          <w:b/>
+        </w:rPr>
+        <w:t>Autoavans</w:t>
+      </w:r>
+      <w:proofErr w:type="spellEnd"/>
+      <w:r>
+        <w:rPr>
+          <w:b/>
+        </w:rPr>
+        <w:t xml:space="preserve"> Technology </w:t>
+      </w:r>
+      <w:r>
+        <w:rPr>
+          <w:b/>
+          <w:sz w:val="20"/>
+        </w:rPr>
+        <w:t>(Sweden</w:t>
+      </w:r>
+      <w:r>
+        <w:rPr>
+          <w:b/>
+          <w:sz w:val="20"/>
+        </w:rPr>
+        <w:t xml:space="preserve"> based Business Operations</w:t>
+      </w:r>
+      <w:r>
+        <w:rPr>
+          <w:b/>
+          <w:sz w:val="20"/>
+        </w:rPr>
+        <w:t>)</w:t>
+      </w:r>
+      <w:r>
+        <w:rPr>
+          <w:b/>
+        </w:rPr>
+        <w:tab/>
+      </w:r>
+      <w:r>
+        <w:rPr>
+          <w:b/>
+          <w:sz w:val="20"/>
+        </w:rPr>
+        <w:tab/>
+      </w:r>
+      <w:r>
+        <w:rPr>
+          <w:b/>
+          <w:sz w:val="20"/>
+        </w:rPr>
+        <w:br/>
+      </w:r>
+      <w:r>
+        <w:rPr>
+          <w:i/>
+          <w:sz w:val="20"/>
+        </w:rPr>
+        <w:t>July 2022 – June 2024</w:t>
+      </w:r>
+    </w:p>
+    <w:p>
+      <w:pPr>
+        <w:pStyle w:val="ListBullet"/>
+      </w:pPr>
+      <w:r>
+        <w:t xml:space="preserve">Responsible for </w:t>
+      </w:r>
+      <w:r>
+        <w:t>migration from jQuery to React architecture, reducing regression bugs by 40% through automated testing.</w:t>
+      </w:r>
+    </w:p>
+    <w:p>
+      <w:pPr>
+        <w:pStyle w:val="ListBullet"/>
+        <w:tabs>
+          <w:tab w:val="clear" w:pos="360"/>
+        </w:tabs>
+      </w:pPr>
+      <w:r>
+        <w:t xml:space="preserve">Responsible for </w:t>
+      </w:r>
+      <w:r>
+        <w:t>Release</w:t>
+      </w:r>
+      <w:r>
+        <w:t xml:space="preserve"> management using CI/CD pipelines and </w:t>
+      </w:r>
+      <w:proofErr w:type="spellStart"/>
+      <w:r>
+        <w:t>GitLab</w:t>
+      </w:r>
+      <w:proofErr w:type="spellEnd"/>
+      <w:r>
+        <w:t xml:space="preserve"> and AWS </w:t>
+      </w:r>
+      <w:r>
+        <w:t>Services</w:t>
+      </w:r>
+      <w:r>
+        <w:t xml:space="preserve"> </w:t>
+      </w:r>
+      <w:r>
+        <w:br/>
+        <w:t>(Cloud Watch, S3 , AWS Secret Manger)</w:t>
+      </w:r>
+      <w:r>
+        <w:t>.</w:t>
+      </w:r>
+    </w:p>
+    <w:p>
+      <w:pPr>
+        <w:pStyle w:val="ListBullet"/>
+      </w:pPr>
+      <w:r>
+        <w:t>Mentored junior developers on clean code principles, SOLID, and modern JavaScript practices.</w:t>
+      </w:r>
+    </w:p>
+    <w:p>
+      <w:pPr>
+        <w:pStyle w:val="ListBullet"/>
+        <w:numPr>
+          <w:ilvl w:val="0"/>
+          <w:numId w:val="0"/>
+        </w:numPr>
+        <w:tabs>
+          <w:tab w:val="left" w:pos="450"/>
+        </w:tabs>
+        <w:rPr>
+          <w:b/>
+        </w:rPr>
+      </w:pPr>
+      <w:r>
+        <w:rPr>
+          <w:b/>
+        </w:rPr>
+        <w:br/>
+      </w:r>
+      <w:r>
+        <w:rPr>
+          <w:b/>
+        </w:rPr>
+        <w:t xml:space="preserve">Senior </w:t>
+      </w:r>
+      <w:r>
+        <w:rPr>
+          <w:b/>
+        </w:rPr>
+        <w:t>Software Engineer</w:t>
+      </w:r>
+      <w:r>
+        <w:rPr>
+          <w:b/>
+        </w:rPr>
+        <w:t xml:space="preserve"> </w:t>
+      </w:r>
+      <w:r>
+        <w:rPr>
+          <w:b/>
+        </w:rPr>
+        <w:t>–</w:t>
+      </w:r>
+      <w:r>
+        <w:rPr>
+          <w:b/>
+        </w:rPr>
+        <w:t xml:space="preserve"> </w:t>
+      </w:r>
+      <w:r>
+        <w:rPr>
+          <w:b/>
+        </w:rPr>
+        <w:t>Mazarin</w:t>
+      </w:r>
+      <w:r>
+        <w:rPr>
+          <w:b/>
+        </w:rPr>
+        <w:t xml:space="preserve"> </w:t>
+      </w:r>
+      <w:r>
+        <w:rPr>
+          <w:b/>
+          <w:sz w:val="20"/>
+        </w:rPr>
+        <w:t>(Sweden</w:t>
+      </w:r>
+      <w:r>
+        <w:rPr>
+          <w:b/>
+          <w:sz w:val="20"/>
+        </w:rPr>
+        <w:t xml:space="preserve"> based Business Operations</w:t>
+      </w:r>
+      <w:r>
+        <w:rPr>
+          <w:b/>
+          <w:sz w:val="20"/>
+        </w:rPr>
+        <w:t>)</w:t>
+      </w:r>
+      <w:r>
+        <w:rPr>
+          <w:b/>
+        </w:rPr>
+        <w:tab/>
+      </w:r>
+      <w:r>
+        <w:rPr>
+          <w:b/>
+        </w:rPr>
+        <w:tab/>
+      </w:r>
+      <w:r>
+        <w:rPr>
+          <w:b/>
+        </w:rPr>
+        <w:tab/>
+      </w:r>
+      <w:r>
+        <w:rPr>
+          <w:b/>
+        </w:rPr>
+        <w:tab/>
+      </w:r>
+      <w:r>
+        <w:rPr>
+          <w:b/>
+        </w:rPr>
+        <w:tab/>
+      </w:r>
+      <w:r>
+        <w:rPr>
+          <w:b/>
+        </w:rPr>
+        <w:br/>
+      </w:r>
+      <w:r>
+        <w:rPr>
+          <w:i/>
+          <w:sz w:val="20"/>
+        </w:rPr>
+        <w:t>Sep 2019 - May</w:t>
+      </w:r>
+      <w:r>
+        <w:rPr>
+          <w:i/>
+          <w:sz w:val="20"/>
+        </w:rPr>
+        <w:t xml:space="preserve"> 2022</w:t>
+      </w:r>
+      <w:r>
+        <w:rPr>
+          <w:i/>
+          <w:sz w:val="20"/>
+        </w:rPr>
+        <w:br/>
+      </w:r>
+    </w:p>
+    <w:p>
+      <w:pPr>
+        <w:pStyle w:val="ListBullet"/>
+      </w:pPr>
+      <w:r>
+        <w:t>Worked on migration</w:t>
+      </w:r>
+      <w:r>
+        <w:t xml:space="preserve"> from </w:t>
+      </w:r>
+      <w:r>
+        <w:t xml:space="preserve">C# </w:t>
+      </w:r>
+      <w:r>
+        <w:t xml:space="preserve">to React </w:t>
+      </w:r>
+      <w:r>
+        <w:t xml:space="preserve">.NET Core </w:t>
+      </w:r>
+      <w:r>
+        <w:t>architecture, reducing regression bugs by 40% through automated testing.</w:t>
+      </w:r>
+    </w:p>
+    <w:p>
+      <w:pPr>
+        <w:pStyle w:val="ListBullet"/>
+      </w:pPr>
+      <w:r>
+        <w:t>Participated in sprint planning with poker planning and collaborated on feature prioritization.</w:t>
+      </w:r>
+    </w:p>
+    <w:p>
+      <w:pPr>
+        <w:pStyle w:val="ListBullet"/>
+        <w:numPr>
+          <w:ilvl w:val="0"/>
+          <w:numId w:val="0"/>
+        </w:numPr>
+        <w:ind w:left="720" w:hanging="360"/>
+      </w:pPr>
+    </w:p>
+    <w:p>
+      <w:pPr>
+        <w:pStyle w:val="ListBullet"/>
+        <w:numPr>
+          <w:ilvl w:val="0"/>
+          <w:numId w:val="0"/>
+        </w:numPr>
+        <w:tabs>
+          <w:tab w:val="left" w:pos="450"/>
+        </w:tabs>
+        <w:rPr>
+          <w:b/>
+        </w:rPr>
+      </w:pPr>
+      <w:r>
+        <w:rPr>
+          <w:b/>
+        </w:rPr>
+        <w:t>Software Engineer</w:t>
+      </w:r>
+      <w:r>
+        <w:rPr>
+          <w:b/>
+        </w:rPr>
+        <w:t xml:space="preserve"> – Mazarin</w:t>
+      </w:r>
+      <w:r>
+        <w:rPr>
+          <w:b/>
+        </w:rPr>
+        <w:t xml:space="preserve"> </w:t>
+      </w:r>
+      <w:r>
+        <w:rPr>
+          <w:b/>
+          <w:sz w:val="20"/>
+        </w:rPr>
+        <w:t>(Sweden</w:t>
+      </w:r>
+      <w:r>
+        <w:rPr>
+          <w:b/>
+          <w:sz w:val="20"/>
+        </w:rPr>
+        <w:t xml:space="preserve"> based Business Operations</w:t>
+      </w:r>
+      <w:r>
+        <w:rPr>
+          <w:b/>
+          <w:sz w:val="20"/>
+        </w:rPr>
+        <w:t>)</w:t>
+      </w:r>
+      <w:r>
+        <w:rPr>
+          <w:b/>
+        </w:rPr>
+        <w:tab/>
+      </w:r>
+      <w:r>
+        <w:rPr>
+          <w:b/>
+        </w:rPr>
+        <w:tab/>
+      </w:r>
+      <w:r>
+        <w:rPr>
+          <w:b/>
+        </w:rPr>
+        <w:tab/>
+      </w:r>
+      <w:r>
+        <w:rPr>
+          <w:b/>
+        </w:rPr>
+        <w:tab/>
+      </w:r>
+      <w:r>
+        <w:rPr>
+          <w:b/>
+        </w:rPr>
+        <w:tab/>
+      </w:r>
+      <w:r>
+        <w:rPr>
+          <w:b/>
+        </w:rPr>
+        <w:br/>
+      </w:r>
+      <w:r>
+        <w:rPr>
+          <w:i/>
+          <w:sz w:val="20"/>
+        </w:rPr>
+        <w:t>Aug</w:t>
+      </w:r>
+      <w:r>
+        <w:rPr>
+          <w:i/>
+          <w:sz w:val="20"/>
+        </w:rPr>
+        <w:t xml:space="preserve"> 201</w:t>
+      </w:r>
+      <w:r>
+        <w:rPr>
+          <w:i/>
+          <w:sz w:val="20"/>
+        </w:rPr>
+        <w:t>7 - Aug 2019</w:t>
+      </w:r>
+      <w:r>
+        <w:rPr>
+          <w:i/>
+          <w:sz w:val="20"/>
+        </w:rPr>
+        <w:br/>
+      </w:r>
+    </w:p>
+    <w:p>
+      <w:pPr>
+        <w:pStyle w:val="ListBullet"/>
+      </w:pPr>
+      <w:r>
+        <w:t xml:space="preserve">Worked as an offshore consultant for </w:t>
+      </w:r>
+      <w:r>
+        <w:rPr>
+          <w:b/>
+        </w:rPr>
+        <w:t>Total Merchant Services USA</w:t>
+      </w:r>
+      <w:r>
+        <w:t>.</w:t>
+      </w:r>
+    </w:p>
+    <w:p>
+      <w:pPr>
+        <w:pStyle w:val="ListBullet"/>
+      </w:pPr>
+      <w:r>
+        <w:t>Collaborated with product managers to define technical requirements and provide effort estimations for quarterly roadmaps.</w:t>
+      </w:r>
+    </w:p>
+    <w:p>
+      <w:pPr>
+        <w:pStyle w:val="ListBullet"/>
+        <w:numPr>
+          <w:ilvl w:val="0"/>
+          <w:numId w:val="0"/>
+        </w:numPr>
+        <w:ind w:left="360" w:hanging="360"/>
+      </w:pPr>
+    </w:p>
+    <w:p>
+      <w:pPr>
+        <w:pStyle w:val="ListBullet"/>
+        <w:numPr>
+          <w:ilvl w:val="0"/>
+          <w:numId w:val="0"/>
+        </w:numPr>
+        <w:tabs>
+          <w:tab w:val="left" w:pos="450"/>
+        </w:tabs>
+        <w:rPr>
+          <w:b/>
+        </w:rPr>
+      </w:pPr>
+      <w:r>
+        <w:rPr>
+          <w:b/>
+        </w:rPr>
+        <w:t>Associate software</w:t>
+      </w:r>
+      <w:r>
+        <w:rPr>
+          <w:b/>
+        </w:rPr>
+        <w:t xml:space="preserve"> Engineer</w:t>
+      </w:r>
+      <w:r>
+        <w:rPr>
+          <w:b/>
+        </w:rPr>
+        <w:t xml:space="preserve"> – </w:t>
+      </w:r>
+      <w:r>
+        <w:rPr>
+          <w:b/>
+        </w:rPr>
+        <w:t xml:space="preserve">Mazarin </w:t>
+      </w:r>
+      <w:r>
+        <w:rPr>
+          <w:b/>
+          <w:sz w:val="20"/>
+        </w:rPr>
+        <w:t>(Sweden</w:t>
+      </w:r>
+      <w:r>
+        <w:rPr>
+          <w:b/>
+          <w:sz w:val="20"/>
+        </w:rPr>
+        <w:t xml:space="preserve"> based Business Operations</w:t>
+      </w:r>
+      <w:r>
+        <w:rPr>
+          <w:b/>
+          <w:sz w:val="20"/>
+        </w:rPr>
+        <w:t>)</w:t>
+      </w:r>
+      <w:r>
+        <w:rPr>
+          <w:b/>
+        </w:rPr>
+        <w:tab/>
+      </w:r>
+      <w:r>
+        <w:rPr>
+          <w:b/>
+        </w:rPr>
+        <w:tab/>
+      </w:r>
+      <w:r>
+        <w:rPr>
+          <w:b/>
+        </w:rPr>
+        <w:tab/>
+      </w:r>
+      <w:r>
+        <w:rPr>
+          <w:b/>
+        </w:rPr>
+        <w:tab/>
+      </w:r>
+      <w:r>
+        <w:rPr>
+          <w:b/>
+        </w:rPr>
+        <w:br/>
+      </w:r>
+      <w:r>
+        <w:rPr>
+          <w:i/>
+          <w:sz w:val="20"/>
+        </w:rPr>
+        <w:t>Sep</w:t>
+      </w:r>
+      <w:r>
+        <w:rPr>
+          <w:i/>
+          <w:sz w:val="20"/>
+        </w:rPr>
+        <w:t xml:space="preserve"> 201</w:t>
+      </w:r>
+      <w:r>
+        <w:rPr>
+          <w:i/>
+          <w:sz w:val="20"/>
+        </w:rPr>
+        <w:t>6</w:t>
+      </w:r>
+      <w:r>
+        <w:rPr>
+          <w:i/>
+          <w:sz w:val="20"/>
+        </w:rPr>
+        <w:t xml:space="preserve"> - </w:t>
+      </w:r>
+      <w:r>
+        <w:rPr>
+          <w:i/>
+          <w:sz w:val="20"/>
+        </w:rPr>
+        <w:t>Sep</w:t>
+      </w:r>
+      <w:r>
+        <w:rPr>
+          <w:i/>
+          <w:sz w:val="20"/>
+        </w:rPr>
+        <w:t xml:space="preserve"> </w:t>
+      </w:r>
+      <w:r>
+        <w:rPr>
+          <w:i/>
+          <w:sz w:val="20"/>
+        </w:rPr>
+        <w:t>2017</w:t>
+      </w:r>
+      <w:r>
+        <w:rPr>
+          <w:i/>
+          <w:sz w:val="20"/>
+        </w:rPr>
+        <w:br/>
+      </w:r>
+    </w:p>
+    <w:p>
+      <w:pPr>
+        <w:pStyle w:val="ListBullet"/>
+      </w:pPr>
+      <w:r>
+        <w:t xml:space="preserve">Developed payment processing platform </w:t>
+      </w:r>
+      <w:r>
+        <w:t xml:space="preserve">features </w:t>
+      </w:r>
+      <w:r>
+        <w:t>handling $12B+ annually for 500K+ merchants.</w:t>
+      </w:r>
+    </w:p>
+    <w:p>
+      <w:pPr>
+        <w:pStyle w:val="ListBullet"/>
+      </w:pPr>
+      <w:r>
+        <w:t>Built customer management, inventory systems, and SSO solution using ASP.NET MVC and C#.</w:t>
+      </w:r>
+    </w:p>
+    <w:p>
+      <w:pPr>
+        <w:pStyle w:val="ListBullet"/>
+      </w:pPr>
+      <w:r>
+        <w:t>Participated in sprint planning with poker planning and collaborated on feature prioritization</w:t>
+      </w:r>
+      <w:r>
+        <w:t>.</w:t>
+      </w:r>
+    </w:p>
+    <w:p>
+      <w:pPr>
+        <w:pStyle w:val="ListBullet"/>
+        <w:numPr>
+          <w:ilvl w:val="0"/>
+          <w:numId w:val="0"/>
+        </w:numPr>
+        <w:tabs>
+          <w:tab w:val="left" w:pos="450"/>
+        </w:tabs>
+        <w:rPr>
+          <w:b/>
+        </w:rPr>
+      </w:pPr>
+      <w:r>
+        <w:br/>
+      </w:r>
+      <w:r>
+        <w:rPr>
+          <w:b/>
+        </w:rPr>
+        <w:br/>
+      </w:r>
+      <w:r>
+        <w:rPr>
+          <w:b/>
+        </w:rPr>
+        <w:br/>
+      </w:r>
+      <w:r>
+        <w:rPr>
+          <w:b/>
+        </w:rPr>
+        <w:br/>
+      </w:r>
+      <w:r>
+        <w:rPr>
+          <w:b/>
+        </w:rPr>
+        <w:lastRenderedPageBreak/>
+        <w:t>Trainee  software</w:t>
+      </w:r>
+      <w:r>
+        <w:rPr>
+          <w:b/>
+        </w:rPr>
+        <w:t xml:space="preserve"> Engineer</w:t>
+      </w:r>
+      <w:r>
+        <w:rPr>
+          <w:b/>
+        </w:rPr>
+        <w:t xml:space="preserve"> – </w:t>
+      </w:r>
+      <w:r>
+        <w:rPr>
+          <w:b/>
+        </w:rPr>
+        <w:t xml:space="preserve">Mazarin </w:t>
+      </w:r>
+      <w:r>
+        <w:rPr>
+          <w:b/>
+        </w:rPr>
+        <w:t xml:space="preserve"> </w:t>
       </w:r>
       <w:bookmarkStart w:id="0" w:name="_GoBack"/>
       <w:bookmarkEnd w:id="0"/>
       <w:r>
-        <w:t>esponse time by 25%.</w:t>
+        <w:rPr>
+          <w:b/>
+          <w:sz w:val="20"/>
+        </w:rPr>
+        <w:t>(Sweden</w:t>
+      </w:r>
+      <w:r>
+        <w:rPr>
+          <w:b/>
+          <w:sz w:val="20"/>
+        </w:rPr>
+        <w:t xml:space="preserve"> based Business Operations</w:t>
+      </w:r>
+      <w:r>
+        <w:rPr>
+          <w:b/>
+          <w:sz w:val="20"/>
+        </w:rPr>
+        <w:t>)</w:t>
+      </w:r>
+      <w:r>
+        <w:rPr>
+          <w:b/>
+        </w:rPr>
+        <w:tab/>
+      </w:r>
+      <w:r>
+        <w:rPr>
+          <w:b/>
+        </w:rPr>
+        <w:tab/>
+      </w:r>
+      <w:r>
+        <w:rPr>
+          <w:b/>
+        </w:rPr>
+        <w:tab/>
+      </w:r>
+      <w:r>
+        <w:rPr>
+          <w:b/>
+        </w:rPr>
+        <w:tab/>
+      </w:r>
+      <w:r>
+        <w:rPr>
+          <w:b/>
+        </w:rPr>
+        <w:tab/>
+      </w:r>
+      <w:r>
+        <w:rPr>
+          <w:b/>
+        </w:rPr>
+        <w:br/>
+      </w:r>
+      <w:r>
+        <w:rPr>
+          <w:i/>
+          <w:sz w:val="20"/>
+        </w:rPr>
+        <w:t>Sep</w:t>
+      </w:r>
+      <w:r>
+        <w:rPr>
+          <w:i/>
+          <w:sz w:val="20"/>
+        </w:rPr>
+        <w:t xml:space="preserve"> 201</w:t>
+      </w:r>
+      <w:r>
+        <w:rPr>
+          <w:i/>
+          <w:sz w:val="20"/>
+        </w:rPr>
+        <w:t>1</w:t>
+      </w:r>
+      <w:r>
+        <w:rPr>
+          <w:i/>
+          <w:sz w:val="20"/>
+        </w:rPr>
+        <w:t xml:space="preserve"> - </w:t>
+      </w:r>
+      <w:r>
+        <w:rPr>
+          <w:i/>
+          <w:sz w:val="20"/>
+        </w:rPr>
+        <w:t>Sep</w:t>
+      </w:r>
+      <w:r>
+        <w:rPr>
+          <w:i/>
+          <w:sz w:val="20"/>
+        </w:rPr>
+        <w:t xml:space="preserve"> </w:t>
+      </w:r>
+      <w:r>
+        <w:rPr>
+          <w:i/>
+          <w:sz w:val="20"/>
+        </w:rPr>
+        <w:t>2016</w:t>
+      </w:r>
+      <w:r>
+        <w:rPr>
+          <w:i/>
+          <w:sz w:val="20"/>
+        </w:rPr>
+        <w:br/>
       </w:r>
     </w:p>
     <w:p>
       <w:pPr>
-        <w:pStyle w:val="Heading1"/>
-      </w:pPr>
-      <w:r>
-        <w:t>Education</w:t>
+        <w:pStyle w:val="ListBullet"/>
+      </w:pPr>
+      <w:r>
+        <w:t xml:space="preserve">Worked as </w:t>
+      </w:r>
+      <w:r>
+        <w:t>a</w:t>
+      </w:r>
+      <w:r>
+        <w:t xml:space="preserve"> </w:t>
+      </w:r>
+      <w:r>
+        <w:t xml:space="preserve">part time </w:t>
+      </w:r>
+      <w:r>
+        <w:t>Intern while studying for my bachelor degree</w:t>
+      </w:r>
+      <w:r>
+        <w:t xml:space="preserve"> program </w:t>
+      </w:r>
+      <w:r>
+        <w:t xml:space="preserve"> </w:t>
       </w:r>
     </w:p>
     <w:p>
+      <w:pPr>
+        <w:pStyle w:val="ListBullet"/>
+      </w:pPr>
+      <w:r>
+        <w:t>Developed full</w:t>
+      </w:r>
+      <w:r>
+        <w:t xml:space="preserve"> stack web application features with C# .NET &amp; MS SQL Server 2008</w:t>
+      </w:r>
+      <w:r>
+        <w:t>.</w:t>
+      </w:r>
+    </w:p>
+    <w:p>
+      <w:pPr>
+        <w:pStyle w:val="ListBullet"/>
+      </w:pPr>
+      <w:r>
+        <w:t>Responsible for performing developer testing on the application report issues to the team</w:t>
+      </w:r>
+      <w:r>
+        <w:t>.</w:t>
+      </w:r>
+      <w:r>
+        <w:t xml:space="preserve"> </w:t>
+      </w:r>
+      <w:r>
+        <w:br/>
+      </w:r>
+    </w:p>
+    <w:p>
+      <w:pPr>
+        <w:pStyle w:val="Heading1"/>
+        <w:rPr>
+          <w:caps/>
+        </w:rPr>
+      </w:pPr>
+      <w:r>
+        <w:rPr>
+          <w:caps/>
+        </w:rPr>
+        <w:t>Education</w:t>
+      </w:r>
+      <w:r>
+        <w:rPr>
+          <w:caps/>
+        </w:rPr>
+        <w:br/>
+      </w:r>
+    </w:p>
+    <w:p>
+      <w:pPr>
+        <w:pStyle w:val="ListBullet"/>
+        <w:tabs>
+          <w:tab w:val="clear" w:pos="360"/>
+        </w:tabs>
+      </w:pPr>
       <w:r>
         <w:rPr>
           <w:b/>
+          <w:sz w:val="20"/>
         </w:rPr>
         <w:t>B</w:t>
       </w:r>
       <w:r>
         <w:rPr>
           <w:b/>
+          <w:sz w:val="20"/>
         </w:rPr>
         <w:t>Eng</w:t>
       </w:r>
       <w:r>
         <w:rPr>
           <w:b/>
+          <w:sz w:val="20"/>
         </w:rPr>
         <w:t xml:space="preserve"> (Hons) in </w:t>
       </w:r>
       <w:r>
         <w:rPr>
           <w:b/>
+          <w:sz w:val="20"/>
         </w:rPr>
         <w:t>Software Engineering</w:t>
       </w:r>
       <w:r>
         <w:rPr>
+          <w:b/>
+          <w:sz w:val="20"/>
+        </w:rPr>
+        <w:t xml:space="preserve"> - Second Class </w:t>
+      </w:r>
+      <w:r>
+        <w:rPr>
+          <w:b/>
+          <w:sz w:val="20"/>
+        </w:rPr>
+        <w:t>Honors</w:t>
+      </w:r>
+      <w:r>
+        <w:rPr>
+          <w:b/>
+          <w:sz w:val="20"/>
+        </w:rPr>
+        <w:t xml:space="preserve"> </w:t>
+      </w:r>
+      <w:r>
+        <w:rPr>
+          <w:b/>
+          <w:sz w:val="20"/>
+        </w:rPr>
+        <w:t>: First Division</w:t>
+      </w:r>
+      <w:r>
+        <w:rPr>
           <w:i/>
         </w:rPr>
         <w:tab/>
@@ -452,73 +1860,47 @@
       <w:r>
         <w:rPr>
           <w:i/>
-        </w:rPr>
-        <w:tab/>
+          <w:sz w:val="20"/>
+        </w:rPr>
+        <w:t>Sep 2010 - Sep 2015</w:t>
       </w:r>
       <w:r>
         <w:rPr>
           <w:i/>
         </w:rPr>
-        <w:tab/>
-      </w:r>
-      <w:r>
-        <w:rPr>
-          <w:i/>
-        </w:rPr>
-        <w:tab/>
-        <w:t>Graduated 201</w:t>
-      </w:r>
-      <w:r>
-        <w:rPr>
-          <w:i/>
-        </w:rPr>
-        <w:t>6</w:t>
-      </w:r>
-      <w:r>
-        <w:rPr>
-          <w:i/>
-        </w:rPr>
         <w:br/>
       </w:r>
       <w:r>
-        <w:rPr>
-          <w:i/>
-        </w:rPr>
+        <w:t>University of Westminster, United Kingdom</w:t>
+      </w:r>
+      <w:r>
+        <w:t>.</w:t>
+      </w:r>
+      <w:r>
         <w:br/>
       </w:r>
       <w:r>
-        <w:t>University of Westminster</w:t>
-      </w:r>
-      <w:r>
-        <w:t>. UK</w:t>
-      </w:r>
-      <w:r>
-        <w:rPr>
+        <w:br/>
+      </w:r>
+    </w:p>
+    <w:p>
+      <w:pPr>
+        <w:pStyle w:val="ListBullet"/>
+        <w:numPr>
+          <w:ilvl w:val="0"/>
+          <w:numId w:val="0"/>
+        </w:numPr>
+      </w:pPr>
+      <w:r>
+        <w:rPr>
+          <w:rFonts w:asciiTheme="majorHAnsi" w:eastAsiaTheme="majorEastAsia" w:hAnsiTheme="majorHAnsi" w:cstheme="majorBidi"/>
           <w:b/>
           <w:bCs/>
-        </w:rPr>
-        <w:br/>
-      </w:r>
-      <w:r>
-        <w:rPr>
-          <w:b/>
-          <w:bCs/>
-        </w:rPr>
-        <w:br/>
-      </w:r>
-      <w:r>
-        <w:t>Certifications</w:t>
-      </w:r>
-    </w:p>
-    <w:p>
-      <w:pPr>
-        <w:pStyle w:val="ListBullet"/>
-      </w:pPr>
-      <w:r>
-        <w:t>A</w:t>
-      </w:r>
-      <w:r>
-        <w:t>WS Certified Solutions Architect – Associate</w:t>
+          <w:color w:val="365F91" w:themeColor="accent1" w:themeShade="BF"/>
+          <w:sz w:val="28"/>
+          <w:szCs w:val="28"/>
+        </w:rPr>
+        <w:t>ADDITIONAL INFORMATION</w:t>
       </w:r>
     </w:p>
     <w:p>
@@ -531,9 +1913,80 @@
         <w:ind w:left="360"/>
       </w:pPr>
     </w:p>
+    <w:p>
+      <w:pPr>
+        <w:pStyle w:val="ListBullet"/>
+      </w:pPr>
+      <w:r>
+        <w:rPr>
+          <w:b/>
+        </w:rPr>
+        <w:t>Languages</w:t>
+      </w:r>
+      <w:r>
+        <w:t>: English (Fluent), Sinhala (Native)</w:t>
+      </w:r>
+      <w:r>
+        <w:br/>
+      </w:r>
+    </w:p>
+    <w:p>
+      <w:pPr>
+        <w:pStyle w:val="ListBullet"/>
+      </w:pPr>
+      <w:r>
+        <w:rPr>
+          <w:b/>
+        </w:rPr>
+        <w:t>Key</w:t>
+      </w:r>
+      <w:r>
+        <w:t xml:space="preserve"> </w:t>
+      </w:r>
+      <w:r>
+        <w:rPr>
+          <w:b/>
+        </w:rPr>
+        <w:t>Strengths</w:t>
+      </w:r>
+      <w:r>
+        <w:t>: Team Leadership, Architecture Design, Performance Optimization, Agile Project Management, Technical Mentoring, Conflict Resolution</w:t>
+      </w:r>
+      <w:r>
+        <w:t>.</w:t>
+      </w:r>
+      <w:r>
+        <w:br/>
+      </w:r>
+    </w:p>
+    <w:p>
+      <w:pPr>
+        <w:pStyle w:val="ListBullet"/>
+      </w:pPr>
+      <w:r>
+        <w:rPr>
+          <w:b/>
+        </w:rPr>
+        <w:t>Certifications</w:t>
+      </w:r>
+      <w:r>
+        <w:t>: AWS Certified Solutions Architect – Associate (SAA-C03)</w:t>
+      </w:r>
+      <w:r>
+        <w:br/>
+      </w:r>
+      <w:hyperlink r:id="rId7" w:history="1">
+        <w:r>
+          <w:rPr>
+            <w:rStyle w:val="Hyperlink"/>
+          </w:rPr>
+          <w:t>https://www.credly.com/badges/01da665b-bcfd-49d1-afc7-421f91ba30cc</w:t>
+        </w:r>
+      </w:hyperlink>
+    </w:p>
     <w:sectPr>
       <w:pgSz w:w="12240" w:h="15840"/>
-      <w:pgMar w:top="720" w:right="1080" w:bottom="720" w:left="1080" w:header="720" w:footer="720" w:gutter="0"/>
+      <w:pgMar w:top="720" w:right="1080" w:bottom="720" w:left="990" w:header="720" w:footer="720" w:gutter="0"/>
       <w:cols w:space="720"/>
       <w:docGrid w:linePitch="360"/>
     </w:sectPr>
@@ -696,7 +2149,7 @@
   <w:abstractNum w:abstractNumId="8" w15:restartNumberingAfterBreak="0">
     <w:nsid w:val="FFFFFF89"/>
     <w:multiLevelType w:val="singleLevel"/>
-    <w:tmpl w:val="29761A62"/>
+    <w:tmpl w:val="707266F8"/>
     <w:lvl w:ilvl="0">
       <w:start w:val="1"/>
       <w:numFmt w:val="bullet"/>
@@ -711,6 +2164,345 @@
       </w:pPr>
       <w:rPr>
         <w:rFonts w:ascii="Symbol" w:hAnsi="Symbol" w:hint="default"/>
+      </w:rPr>
+    </w:lvl>
+  </w:abstractNum>
+  <w:abstractNum w:abstractNumId="9" w15:restartNumberingAfterBreak="0">
+    <w:nsid w:val="439F76D8"/>
+    <w:multiLevelType w:val="hybridMultilevel"/>
+    <w:tmpl w:val="01C05D60"/>
+    <w:lvl w:ilvl="0" w:tplc="04090001">
+      <w:start w:val="1"/>
+      <w:numFmt w:val="bullet"/>
+      <w:lvlText w:val=""/>
+      <w:lvlJc w:val="left"/>
+      <w:pPr>
+        <w:ind w:left="720" w:hanging="360"/>
+      </w:pPr>
+      <w:rPr>
+        <w:rFonts w:ascii="Symbol" w:hAnsi="Symbol" w:hint="default"/>
+      </w:rPr>
+    </w:lvl>
+    <w:lvl w:ilvl="1" w:tplc="04090003" w:tentative="1">
+      <w:start w:val="1"/>
+      <w:numFmt w:val="bullet"/>
+      <w:lvlText w:val="o"/>
+      <w:lvlJc w:val="left"/>
+      <w:pPr>
+        <w:ind w:left="1440" w:hanging="360"/>
+      </w:pPr>
+      <w:rPr>
+        <w:rFonts w:ascii="Courier New" w:hAnsi="Courier New" w:cs="Courier New" w:hint="default"/>
+      </w:rPr>
+    </w:lvl>
+    <w:lvl w:ilvl="2" w:tplc="04090005" w:tentative="1">
+      <w:start w:val="1"/>
+      <w:numFmt w:val="bullet"/>
+      <w:lvlText w:val=""/>
+      <w:lvlJc w:val="left"/>
+      <w:pPr>
+        <w:ind w:left="2160" w:hanging="360"/>
+      </w:pPr>
+      <w:rPr>
+        <w:rFonts w:ascii="Wingdings" w:hAnsi="Wingdings" w:hint="default"/>
+      </w:rPr>
+    </w:lvl>
+    <w:lvl w:ilvl="3" w:tplc="04090001" w:tentative="1">
+      <w:start w:val="1"/>
+      <w:numFmt w:val="bullet"/>
+      <w:lvlText w:val=""/>
+      <w:lvlJc w:val="left"/>
+      <w:pPr>
+        <w:ind w:left="2880" w:hanging="360"/>
+      </w:pPr>
+      <w:rPr>
+        <w:rFonts w:ascii="Symbol" w:hAnsi="Symbol" w:hint="default"/>
+      </w:rPr>
+    </w:lvl>
+    <w:lvl w:ilvl="4" w:tplc="04090003" w:tentative="1">
+      <w:start w:val="1"/>
+      <w:numFmt w:val="bullet"/>
+      <w:lvlText w:val="o"/>
+      <w:lvlJc w:val="left"/>
+      <w:pPr>
+        <w:ind w:left="3600" w:hanging="360"/>
+      </w:pPr>
+      <w:rPr>
+        <w:rFonts w:ascii="Courier New" w:hAnsi="Courier New" w:cs="Courier New" w:hint="default"/>
+      </w:rPr>
+    </w:lvl>
+    <w:lvl w:ilvl="5" w:tplc="04090005" w:tentative="1">
+      <w:start w:val="1"/>
+      <w:numFmt w:val="bullet"/>
+      <w:lvlText w:val=""/>
+      <w:lvlJc w:val="left"/>
+      <w:pPr>
+        <w:ind w:left="4320" w:hanging="360"/>
+      </w:pPr>
+      <w:rPr>
+        <w:rFonts w:ascii="Wingdings" w:hAnsi="Wingdings" w:hint="default"/>
+      </w:rPr>
+    </w:lvl>
+    <w:lvl w:ilvl="6" w:tplc="04090001" w:tentative="1">
+      <w:start w:val="1"/>
+      <w:numFmt w:val="bullet"/>
+      <w:lvlText w:val=""/>
+      <w:lvlJc w:val="left"/>
+      <w:pPr>
+        <w:ind w:left="5040" w:hanging="360"/>
+      </w:pPr>
+      <w:rPr>
+        <w:rFonts w:ascii="Symbol" w:hAnsi="Symbol" w:hint="default"/>
+      </w:rPr>
+    </w:lvl>
+    <w:lvl w:ilvl="7" w:tplc="04090003" w:tentative="1">
+      <w:start w:val="1"/>
+      <w:numFmt w:val="bullet"/>
+      <w:lvlText w:val="o"/>
+      <w:lvlJc w:val="left"/>
+      <w:pPr>
+        <w:ind w:left="5760" w:hanging="360"/>
+      </w:pPr>
+      <w:rPr>
+        <w:rFonts w:ascii="Courier New" w:hAnsi="Courier New" w:cs="Courier New" w:hint="default"/>
+      </w:rPr>
+    </w:lvl>
+    <w:lvl w:ilvl="8" w:tplc="04090005" w:tentative="1">
+      <w:start w:val="1"/>
+      <w:numFmt w:val="bullet"/>
+      <w:lvlText w:val=""/>
+      <w:lvlJc w:val="left"/>
+      <w:pPr>
+        <w:ind w:left="6480" w:hanging="360"/>
+      </w:pPr>
+      <w:rPr>
+        <w:rFonts w:ascii="Wingdings" w:hAnsi="Wingdings" w:hint="default"/>
+      </w:rPr>
+    </w:lvl>
+  </w:abstractNum>
+  <w:abstractNum w:abstractNumId="10" w15:restartNumberingAfterBreak="0">
+    <w:nsid w:val="5BE51C68"/>
+    <w:multiLevelType w:val="hybridMultilevel"/>
+    <w:tmpl w:val="BCB855C2"/>
+    <w:lvl w:ilvl="0" w:tplc="04090001">
+      <w:start w:val="1"/>
+      <w:numFmt w:val="bullet"/>
+      <w:lvlText w:val=""/>
+      <w:lvlJc w:val="left"/>
+      <w:pPr>
+        <w:ind w:left="720" w:hanging="360"/>
+      </w:pPr>
+      <w:rPr>
+        <w:rFonts w:ascii="Symbol" w:hAnsi="Symbol" w:hint="default"/>
+      </w:rPr>
+    </w:lvl>
+    <w:lvl w:ilvl="1" w:tplc="04090003" w:tentative="1">
+      <w:start w:val="1"/>
+      <w:numFmt w:val="bullet"/>
+      <w:lvlText w:val="o"/>
+      <w:lvlJc w:val="left"/>
+      <w:pPr>
+        <w:ind w:left="1440" w:hanging="360"/>
+      </w:pPr>
+      <w:rPr>
+        <w:rFonts w:ascii="Courier New" w:hAnsi="Courier New" w:cs="Courier New" w:hint="default"/>
+      </w:rPr>
+    </w:lvl>
+    <w:lvl w:ilvl="2" w:tplc="04090005" w:tentative="1">
+      <w:start w:val="1"/>
+      <w:numFmt w:val="bullet"/>
+      <w:lvlText w:val=""/>
+      <w:lvlJc w:val="left"/>
+      <w:pPr>
+        <w:ind w:left="2160" w:hanging="360"/>
+      </w:pPr>
+      <w:rPr>
+        <w:rFonts w:ascii="Wingdings" w:hAnsi="Wingdings" w:hint="default"/>
+      </w:rPr>
+    </w:lvl>
+    <w:lvl w:ilvl="3" w:tplc="04090001" w:tentative="1">
+      <w:start w:val="1"/>
+      <w:numFmt w:val="bullet"/>
+      <w:lvlText w:val=""/>
+      <w:lvlJc w:val="left"/>
+      <w:pPr>
+        <w:ind w:left="2880" w:hanging="360"/>
+      </w:pPr>
+      <w:rPr>
+        <w:rFonts w:ascii="Symbol" w:hAnsi="Symbol" w:hint="default"/>
+      </w:rPr>
+    </w:lvl>
+    <w:lvl w:ilvl="4" w:tplc="04090003" w:tentative="1">
+      <w:start w:val="1"/>
+      <w:numFmt w:val="bullet"/>
+      <w:lvlText w:val="o"/>
+      <w:lvlJc w:val="left"/>
+      <w:pPr>
+        <w:ind w:left="3600" w:hanging="360"/>
+      </w:pPr>
+      <w:rPr>
+        <w:rFonts w:ascii="Courier New" w:hAnsi="Courier New" w:cs="Courier New" w:hint="default"/>
+      </w:rPr>
+    </w:lvl>
+    <w:lvl w:ilvl="5" w:tplc="04090005" w:tentative="1">
+      <w:start w:val="1"/>
+      <w:numFmt w:val="bullet"/>
+      <w:lvlText w:val=""/>
+      <w:lvlJc w:val="left"/>
+      <w:pPr>
+        <w:ind w:left="4320" w:hanging="360"/>
+      </w:pPr>
+      <w:rPr>
+        <w:rFonts w:ascii="Wingdings" w:hAnsi="Wingdings" w:hint="default"/>
+      </w:rPr>
+    </w:lvl>
+    <w:lvl w:ilvl="6" w:tplc="04090001" w:tentative="1">
+      <w:start w:val="1"/>
+      <w:numFmt w:val="bullet"/>
+      <w:lvlText w:val=""/>
+      <w:lvlJc w:val="left"/>
+      <w:pPr>
+        <w:ind w:left="5040" w:hanging="360"/>
+      </w:pPr>
+      <w:rPr>
+        <w:rFonts w:ascii="Symbol" w:hAnsi="Symbol" w:hint="default"/>
+      </w:rPr>
+    </w:lvl>
+    <w:lvl w:ilvl="7" w:tplc="04090003" w:tentative="1">
+      <w:start w:val="1"/>
+      <w:numFmt w:val="bullet"/>
+      <w:lvlText w:val="o"/>
+      <w:lvlJc w:val="left"/>
+      <w:pPr>
+        <w:ind w:left="5760" w:hanging="360"/>
+      </w:pPr>
+      <w:rPr>
+        <w:rFonts w:ascii="Courier New" w:hAnsi="Courier New" w:cs="Courier New" w:hint="default"/>
+      </w:rPr>
+    </w:lvl>
+    <w:lvl w:ilvl="8" w:tplc="04090005" w:tentative="1">
+      <w:start w:val="1"/>
+      <w:numFmt w:val="bullet"/>
+      <w:lvlText w:val=""/>
+      <w:lvlJc w:val="left"/>
+      <w:pPr>
+        <w:ind w:left="6480" w:hanging="360"/>
+      </w:pPr>
+      <w:rPr>
+        <w:rFonts w:ascii="Wingdings" w:hAnsi="Wingdings" w:hint="default"/>
+      </w:rPr>
+    </w:lvl>
+  </w:abstractNum>
+  <w:abstractNum w:abstractNumId="11" w15:restartNumberingAfterBreak="0">
+    <w:nsid w:val="743E4B0D"/>
+    <w:multiLevelType w:val="hybridMultilevel"/>
+    <w:tmpl w:val="CA4EB5F8"/>
+    <w:lvl w:ilvl="0" w:tplc="04090001">
+      <w:start w:val="1"/>
+      <w:numFmt w:val="bullet"/>
+      <w:lvlText w:val=""/>
+      <w:lvlJc w:val="left"/>
+      <w:pPr>
+        <w:ind w:left="1080" w:hanging="360"/>
+      </w:pPr>
+      <w:rPr>
+        <w:rFonts w:ascii="Symbol" w:hAnsi="Symbol" w:hint="default"/>
+      </w:rPr>
+    </w:lvl>
+    <w:lvl w:ilvl="1" w:tplc="04090003" w:tentative="1">
+      <w:start w:val="1"/>
+      <w:numFmt w:val="bullet"/>
+      <w:lvlText w:val="o"/>
+      <w:lvlJc w:val="left"/>
+      <w:pPr>
+        <w:ind w:left="1800" w:hanging="360"/>
+      </w:pPr>
+      <w:rPr>
+        <w:rFonts w:ascii="Courier New" w:hAnsi="Courier New" w:cs="Courier New" w:hint="default"/>
+      </w:rPr>
+    </w:lvl>
+    <w:lvl w:ilvl="2" w:tplc="04090005" w:tentative="1">
+      <w:start w:val="1"/>
+      <w:numFmt w:val="bullet"/>
+      <w:lvlText w:val=""/>
+      <w:lvlJc w:val="left"/>
+      <w:pPr>
+        <w:ind w:left="2520" w:hanging="360"/>
+      </w:pPr>
+      <w:rPr>
+        <w:rFonts w:ascii="Wingdings" w:hAnsi="Wingdings" w:hint="default"/>
+      </w:rPr>
+    </w:lvl>
+    <w:lvl w:ilvl="3" w:tplc="04090001" w:tentative="1">
+      <w:start w:val="1"/>
+      <w:numFmt w:val="bullet"/>
+      <w:lvlText w:val=""/>
+      <w:lvlJc w:val="left"/>
+      <w:pPr>
+        <w:ind w:left="3240" w:hanging="360"/>
+      </w:pPr>
+      <w:rPr>
+        <w:rFonts w:ascii="Symbol" w:hAnsi="Symbol" w:hint="default"/>
+      </w:rPr>
+    </w:lvl>
+    <w:lvl w:ilvl="4" w:tplc="04090003" w:tentative="1">
+      <w:start w:val="1"/>
+      <w:numFmt w:val="bullet"/>
+      <w:lvlText w:val="o"/>
+      <w:lvlJc w:val="left"/>
+      <w:pPr>
+        <w:ind w:left="3960" w:hanging="360"/>
+      </w:pPr>
+      <w:rPr>
+        <w:rFonts w:ascii="Courier New" w:hAnsi="Courier New" w:cs="Courier New" w:hint="default"/>
+      </w:rPr>
+    </w:lvl>
+    <w:lvl w:ilvl="5" w:tplc="04090005" w:tentative="1">
+      <w:start w:val="1"/>
+      <w:numFmt w:val="bullet"/>
+      <w:lvlText w:val=""/>
+      <w:lvlJc w:val="left"/>
+      <w:pPr>
+        <w:ind w:left="4680" w:hanging="360"/>
+      </w:pPr>
+      <w:rPr>
+        <w:rFonts w:ascii="Wingdings" w:hAnsi="Wingdings" w:hint="default"/>
+      </w:rPr>
+    </w:lvl>
+    <w:lvl w:ilvl="6" w:tplc="04090001" w:tentative="1">
+      <w:start w:val="1"/>
+      <w:numFmt w:val="bullet"/>
+      <w:lvlText w:val=""/>
+      <w:lvlJc w:val="left"/>
+      <w:pPr>
+        <w:ind w:left="5400" w:hanging="360"/>
+      </w:pPr>
+      <w:rPr>
+        <w:rFonts w:ascii="Symbol" w:hAnsi="Symbol" w:hint="default"/>
+      </w:rPr>
+    </w:lvl>
+    <w:lvl w:ilvl="7" w:tplc="04090003" w:tentative="1">
+      <w:start w:val="1"/>
+      <w:numFmt w:val="bullet"/>
+      <w:lvlText w:val="o"/>
+      <w:lvlJc w:val="left"/>
+      <w:pPr>
+        <w:ind w:left="6120" w:hanging="360"/>
+      </w:pPr>
+      <w:rPr>
+        <w:rFonts w:ascii="Courier New" w:hAnsi="Courier New" w:cs="Courier New" w:hint="default"/>
+      </w:rPr>
+    </w:lvl>
+    <w:lvl w:ilvl="8" w:tplc="04090005" w:tentative="1">
+      <w:start w:val="1"/>
+      <w:numFmt w:val="bullet"/>
+      <w:lvlText w:val=""/>
+      <w:lvlJc w:val="left"/>
+      <w:pPr>
+        <w:ind w:left="6840" w:hanging="360"/>
+      </w:pPr>
+      <w:rPr>
+        <w:rFonts w:ascii="Wingdings" w:hAnsi="Wingdings" w:hint="default"/>
       </w:rPr>
     </w:lvl>
   </w:abstractNum>
@@ -740,6 +2532,15 @@
   </w:num>
   <w:num w:numId="9">
     <w:abstractNumId w:val="0"/>
+  </w:num>
+  <w:num w:numId="10">
+    <w:abstractNumId w:val="11"/>
+  </w:num>
+  <w:num w:numId="11">
+    <w:abstractNumId w:val="10"/>
+  </w:num>
+  <w:num w:numId="12">
+    <w:abstractNumId w:val="9"/>
   </w:num>
 </w:numbering>
 </file>
@@ -12130,6 +13931,18 @@
       <w:u w:val="single"/>
     </w:rPr>
   </w:style>
+  <w:style w:type="character" w:styleId="FollowedHyperlink">
+    <w:name w:val="FollowedHyperlink"/>
+    <w:basedOn w:val="DefaultParagraphFont"/>
+    <w:uiPriority w:val="99"/>
+    <w:semiHidden/>
+    <w:unhideWhenUsed/>
+    <w:rsid w:val="00DE3210"/>
+    <w:rPr>
+      <w:color w:val="800080" w:themeColor="followedHyperlink"/>
+      <w:u w:val="single"/>
+    </w:rPr>
+  </w:style>
 </w:styles>
 </file>
 
@@ -12458,7 +14271,7 @@
 </file>
 
 <file path=customXml/itemProps1.xml><?xml version="1.0" encoding="utf-8"?>
-<ds:datastoreItem xmlns:ds="http://schemas.openxmlformats.org/officeDocument/2006/customXml" ds:itemID="{0AA41DAE-FD61-4265-A7E5-24D204E8939A}">
+<ds:datastoreItem xmlns:ds="http://schemas.openxmlformats.org/officeDocument/2006/customXml" ds:itemID="{032C6143-83EF-4D45-AEE2-D5FDD99392D9}">
   <ds:schemaRefs>
     <ds:schemaRef ds:uri="http://schemas.openxmlformats.org/officeDocument/2006/bibliography"/>
   </ds:schemaRefs>

</xml_diff>